<commit_message>
added gaze360 eth xgaze, started gazeunconstrained
</commit_message>
<xml_diff>
--- a/review.docx
+++ b/review.docx
@@ -1660,21 +1660,7 @@
           <w:sz w:val="16"/>
           <w:szCs w:val="16"/>
         </w:rPr>
-        <w:t xml:space="preserve">Vor der Datensammlungsphase wurden die 3D Positionen der „six facial landmarks“ mit einer externen </w:t>
-      </w:r>
-      <w:r>
-        <w:rPr>
-          <w:sz w:val="16"/>
-          <w:szCs w:val="16"/>
-        </w:rPr>
-        <w:t>Stereokamera</w:t>
-      </w:r>
-      <w:r>
-        <w:rPr>
-          <w:sz w:val="16"/>
-          <w:szCs w:val="16"/>
-        </w:rPr>
-        <w:t xml:space="preserve"> aufgenommen.</w:t>
+        <w:t>Vor der Datensammlungsphase wurden die 3D Positionen der „six facial landmarks“ mit einer externen Stereokamera aufgenommen.</w:t>
       </w:r>
     </w:p>
     <w:p>
@@ -1793,6 +1779,651 @@
           <w:szCs w:val="16"/>
         </w:rPr>
       </w:pPr>
+    </w:p>
+    <w:p>
+      <w:pPr>
+        <w:rPr>
+          <w:sz w:val="16"/>
+          <w:szCs w:val="16"/>
+        </w:rPr>
+      </w:pPr>
+      <w:r>
+        <w:rPr>
+          <w:sz w:val="16"/>
+          <w:szCs w:val="16"/>
+        </w:rPr>
+        <w:br w:type="page"/>
+      </w:r>
+    </w:p>
+    <w:p>
+      <w:pPr>
+        <w:rPr>
+          <w:sz w:val="16"/>
+          <w:szCs w:val="16"/>
+        </w:rPr>
+      </w:pPr>
+      <w:r>
+        <w:rPr>
+          <w:sz w:val="16"/>
+          <w:szCs w:val="16"/>
+        </w:rPr>
+        <w:lastRenderedPageBreak/>
+        <w:t>Gaze360:</w:t>
+      </w:r>
+    </w:p>
+    <w:p>
+      <w:pPr>
+        <w:rPr>
+          <w:sz w:val="16"/>
+          <w:szCs w:val="16"/>
+        </w:rPr>
+      </w:pPr>
+      <w:r>
+        <w:rPr>
+          <w:sz w:val="16"/>
+          <w:szCs w:val="16"/>
+        </w:rPr>
+        <w:t>Der Gaze360 Datensatz</w:t>
+      </w:r>
+      <w:r>
+        <w:rPr>
+          <w:sz w:val="16"/>
+          <w:szCs w:val="16"/>
+        </w:rPr>
+        <w:t xml:space="preserve"> stellt </w:t>
+      </w:r>
+      <w:r>
+        <w:rPr>
+          <w:sz w:val="16"/>
+          <w:szCs w:val="16"/>
+        </w:rPr>
+        <w:t>Outdoordaten</w:t>
+      </w:r>
+      <w:r>
+        <w:rPr>
+          <w:sz w:val="16"/>
+          <w:szCs w:val="16"/>
+        </w:rPr>
+        <w:t xml:space="preserve"> bereit, die im Gegensatz zu anderen Datensätzen frei von der Frontalansicht ist und </w:t>
+      </w:r>
+      <w:r>
+        <w:rPr>
+          <w:sz w:val="16"/>
+          <w:szCs w:val="16"/>
+        </w:rPr>
+        <w:t>mehrere Testpersonen gleichzeitig testet.</w:t>
+      </w:r>
+      <w:r>
+        <w:rPr>
+          <w:sz w:val="16"/>
+          <w:szCs w:val="16"/>
+        </w:rPr>
+        <w:t xml:space="preserve"> Bei diesem Datensatz sollten die Testpersonen so viele Freiheiten wie möglich haben in ihrer Kopfpose und Blickrichtung.</w:t>
+      </w:r>
+      <w:r>
+        <w:rPr>
+          <w:sz w:val="16"/>
+          <w:szCs w:val="16"/>
+        </w:rPr>
+        <w:t xml:space="preserve"> Dieser Datensatz kann besonders für die Gaze Estimation bei Überwachungskameras attraktiv sein</w:t>
+      </w:r>
+    </w:p>
+    <w:p>
+      <w:pPr>
+        <w:rPr>
+          <w:sz w:val="16"/>
+          <w:szCs w:val="16"/>
+        </w:rPr>
+      </w:pPr>
+      <w:r>
+        <w:rPr>
+          <w:sz w:val="16"/>
+          <w:szCs w:val="16"/>
+        </w:rPr>
+        <w:t xml:space="preserve">Aufbau: Das Setup ist um die Ladybug5 360° Panoramic Camera gebaut, welche mit einem Tripod in der Mitte platziert wird. Sie besteht aus überlappenden 5 megapixel Kameras, jede mit 120° Sichtbereich. Das Gaze Target ist ein Schild mit einem AprilTag, welches von den Testpersonen </w:t>
+      </w:r>
+      <w:r>
+        <w:rPr>
+          <w:sz w:val="16"/>
+          <w:szCs w:val="16"/>
+        </w:rPr>
+        <w:t>kontinuierlich</w:t>
+      </w:r>
+      <w:r>
+        <w:rPr>
+          <w:sz w:val="16"/>
+          <w:szCs w:val="16"/>
+        </w:rPr>
+        <w:t xml:space="preserve"> beobachtet wird. Jedes Frame wird als 3382x4096 pixel Bild gespeichert</w:t>
+      </w:r>
+      <w:r>
+        <w:rPr>
+          <w:sz w:val="16"/>
+          <w:szCs w:val="16"/>
+        </w:rPr>
+        <w:t>, nach der Entfernung von Fishaugeneffekt und Verzerrungen</w:t>
+      </w:r>
+      <w:r>
+        <w:rPr>
+          <w:sz w:val="16"/>
+          <w:szCs w:val="16"/>
+        </w:rPr>
+        <w:t>.</w:t>
+      </w:r>
+    </w:p>
+    <w:p>
+      <w:pPr>
+        <w:rPr>
+          <w:sz w:val="16"/>
+          <w:szCs w:val="16"/>
+        </w:rPr>
+      </w:pPr>
+      <w:r>
+        <w:rPr>
+          <w:sz w:val="16"/>
+          <w:szCs w:val="16"/>
+        </w:rPr>
+        <w:t xml:space="preserve">Das Setup </w:t>
+      </w:r>
+      <w:r>
+        <w:rPr>
+          <w:sz w:val="16"/>
+          <w:szCs w:val="16"/>
+        </w:rPr>
+        <w:t>besteht nur aus Kamera, Laptop, Stromquelle und Gaze Target und ist daher</w:t>
+      </w:r>
+      <w:r>
+        <w:rPr>
+          <w:sz w:val="16"/>
+          <w:szCs w:val="16"/>
+        </w:rPr>
+        <w:t xml:space="preserve"> sehr mobil</w:t>
+      </w:r>
+      <w:r>
+        <w:rPr>
+          <w:sz w:val="16"/>
+          <w:szCs w:val="16"/>
+        </w:rPr>
+        <w:t>. Es erlaubt einen effizienten Einsatz an vielen verschiedenen Orten.</w:t>
+      </w:r>
+    </w:p>
+    <w:p>
+      <w:pPr>
+        <w:rPr>
+          <w:sz w:val="16"/>
+          <w:szCs w:val="16"/>
+        </w:rPr>
+      </w:pPr>
+      <w:r>
+        <w:rPr>
+          <w:sz w:val="16"/>
+          <w:szCs w:val="16"/>
+        </w:rPr>
+        <w:t xml:space="preserve">Für die Erkennung der Testpersonen wird mit AlphaPose Kopf und Fuß einer Testperson erkannt. </w:t>
+      </w:r>
+      <w:r>
+        <w:rPr>
+          <w:sz w:val="16"/>
+          <w:szCs w:val="16"/>
+        </w:rPr>
+        <w:t>Bei Personen,</w:t>
+      </w:r>
+      <w:r>
+        <w:rPr>
+          <w:sz w:val="16"/>
+          <w:szCs w:val="16"/>
+        </w:rPr>
+        <w:t xml:space="preserve"> wo </w:t>
+      </w:r>
+      <w:r>
+        <w:rPr>
+          <w:sz w:val="16"/>
+          <w:szCs w:val="16"/>
+        </w:rPr>
+        <w:t xml:space="preserve">die </w:t>
+      </w:r>
+      <w:r>
+        <w:rPr>
+          <w:sz w:val="16"/>
+          <w:szCs w:val="16"/>
+        </w:rPr>
+        <w:t>Füße nicht erkennbar sind, wird die Position berechnet mit Durchschnitts Körperproportion</w:t>
+      </w:r>
+      <w:r>
+        <w:rPr>
+          <w:sz w:val="16"/>
+          <w:szCs w:val="16"/>
+        </w:rPr>
+        <w:t>s</w:t>
+      </w:r>
+      <w:r>
+        <w:rPr>
+          <w:sz w:val="16"/>
+          <w:szCs w:val="16"/>
+        </w:rPr>
+        <w:t>schätz</w:t>
+      </w:r>
+      <w:r>
+        <w:rPr>
+          <w:sz w:val="16"/>
+          <w:szCs w:val="16"/>
+        </w:rPr>
+        <w:t>u</w:t>
+      </w:r>
+      <w:r>
+        <w:rPr>
+          <w:sz w:val="16"/>
+          <w:szCs w:val="16"/>
+        </w:rPr>
+        <w:t>ngen.</w:t>
+      </w:r>
+    </w:p>
+    <w:p>
+      <w:pPr>
+        <w:rPr>
+          <w:sz w:val="16"/>
+          <w:szCs w:val="16"/>
+        </w:rPr>
+      </w:pPr>
+      <w:r>
+        <w:rPr>
+          <w:sz w:val="16"/>
+          <w:szCs w:val="16"/>
+        </w:rPr>
+        <w:t>Das Gaze Target</w:t>
+      </w:r>
+      <w:r>
+        <w:rPr>
+          <w:sz w:val="16"/>
+          <w:szCs w:val="16"/>
+        </w:rPr>
+        <w:t xml:space="preserve"> besteht aus AprilTag zur Verfolgung der 3D Position des Targets über die Kamera, und einem Kreuz unten, worauf der Blick der Testpersonen fixiert werden soll. </w:t>
+      </w:r>
+    </w:p>
+    <w:p>
+      <w:pPr>
+        <w:rPr>
+          <w:sz w:val="16"/>
+          <w:szCs w:val="16"/>
+        </w:rPr>
+      </w:pPr>
+      <w:r>
+        <w:rPr>
+          <w:sz w:val="16"/>
+          <w:szCs w:val="16"/>
+        </w:rPr>
+        <w:t>Der Gaze Vektor wird über eine Differenz von Gaze Target zu Testperson berechnet. Danach muss der Gaze vom Kamera Koordinatensystem zum Kartesischen Augen Koordinatensystem umgewandelt werden.</w:t>
+      </w:r>
+    </w:p>
+    <w:p>
+      <w:pPr>
+        <w:rPr>
+          <w:sz w:val="16"/>
+          <w:szCs w:val="16"/>
+        </w:rPr>
+      </w:pPr>
+      <w:r>
+        <w:rPr>
+          <w:sz w:val="16"/>
+          <w:szCs w:val="16"/>
+        </w:rPr>
+        <w:t xml:space="preserve">Test: Testpersonen </w:t>
+      </w:r>
+      <w:r>
+        <w:rPr>
+          <w:sz w:val="16"/>
+          <w:szCs w:val="16"/>
+        </w:rPr>
+        <w:t>stehen</w:t>
+      </w:r>
+      <w:r>
+        <w:rPr>
+          <w:sz w:val="16"/>
+          <w:szCs w:val="16"/>
+        </w:rPr>
+        <w:t xml:space="preserve"> ungefähr 1-3m von der Kamera entfernt</w:t>
+      </w:r>
+      <w:r>
+        <w:rPr>
+          <w:sz w:val="16"/>
+          <w:szCs w:val="16"/>
+        </w:rPr>
+        <w:t>. Zur Sicherheit bewegen sie sich nicht von ihrer Startposition. Das Gaze Target wird in einer großen Bewegung um die Testpersonen und die Kamera bewegt und danach zwischen ihnen.</w:t>
+      </w:r>
+      <w:r>
+        <w:rPr>
+          <w:sz w:val="16"/>
+          <w:szCs w:val="16"/>
+        </w:rPr>
+        <w:t xml:space="preserve"> Während der Bewegung wurde das Schild hoch und runter bewegt, um noch mehr Variation zu bekommen. Der Pfad ist bewusst so gewählt, das alle möglichen Blickrichtungen ausgedeckt sind. Der innere Pfad soll Variation für eine extreme Blickrichtung darstellen. Der AprilTag ist während des Tests immer frontal von der Kamera sichtbar. Zusätzllich wird mit den Befehlen „move“ (erlaubt Kopfbewegungen) und „freeze“ (nur Augenbewegung) die Kopfbewegung der Testpersonen gesteuert.</w:t>
+      </w:r>
+    </w:p>
+    <w:p>
+      <w:pPr>
+        <w:rPr>
+          <w:sz w:val="16"/>
+          <w:szCs w:val="16"/>
+        </w:rPr>
+      </w:pPr>
+      <w:r>
+        <w:rPr>
+          <w:sz w:val="16"/>
+          <w:szCs w:val="16"/>
+        </w:rPr>
+        <w:t>Insgesamt wurden in 9 Sitzungen an 5 Orten drinnen (53 Testpersonen) und 2 Orten draußen (185 Testpersonen) insgesamt 238 Testpersonen gefilmt.</w:t>
+      </w:r>
+    </w:p>
+    <w:p>
+      <w:pPr>
+        <w:rPr>
+          <w:sz w:val="16"/>
+          <w:szCs w:val="16"/>
+        </w:rPr>
+      </w:pPr>
+      <w:r>
+        <w:rPr>
+          <w:sz w:val="16"/>
+          <w:szCs w:val="16"/>
+        </w:rPr>
+        <w:t>Es gibt Variationen in Umgebung, Beleuchtung, Alter, Geschlecht, Ethnie, Kopfpose und Blickrichtung. Zudem Ganzkörperbilder und Nahaufnahmen.</w:t>
+      </w:r>
+    </w:p>
+    <w:p>
+      <w:pPr>
+        <w:rPr>
+          <w:sz w:val="16"/>
+          <w:szCs w:val="16"/>
+        </w:rPr>
+      </w:pPr>
+      <w:r>
+        <w:rPr>
+          <w:sz w:val="16"/>
+          <w:szCs w:val="16"/>
+        </w:rPr>
+        <w:t>Kopfpose: horizontal [-90°, 90°], vertikal limitiert</w:t>
+      </w:r>
+    </w:p>
+    <w:p>
+      <w:pPr>
+        <w:rPr>
+          <w:sz w:val="16"/>
+          <w:szCs w:val="16"/>
+        </w:rPr>
+      </w:pPr>
+      <w:r>
+        <w:rPr>
+          <w:sz w:val="16"/>
+          <w:szCs w:val="16"/>
+        </w:rPr>
+        <w:t>Blickrichtung: horizontal [-140°, 140°]</w:t>
+      </w:r>
+      <w:r>
+        <w:rPr>
+          <w:sz w:val="16"/>
+          <w:szCs w:val="16"/>
+        </w:rPr>
+        <w:t xml:space="preserve"> aber wenige Samples über [-70, 70]</w:t>
+      </w:r>
+    </w:p>
+    <w:p>
+      <w:pPr>
+        <w:rPr>
+          <w:sz w:val="16"/>
+          <w:szCs w:val="16"/>
+        </w:rPr>
+      </w:pPr>
+    </w:p>
+    <w:p>
+      <w:pPr>
+        <w:rPr>
+          <w:sz w:val="16"/>
+          <w:szCs w:val="16"/>
+        </w:rPr>
+      </w:pPr>
+    </w:p>
+    <w:p>
+      <w:pPr>
+        <w:rPr>
+          <w:sz w:val="16"/>
+          <w:szCs w:val="16"/>
+        </w:rPr>
+      </w:pPr>
+      <w:r>
+        <w:rPr>
+          <w:sz w:val="16"/>
+          <w:szCs w:val="16"/>
+        </w:rPr>
+        <w:br w:type="page"/>
+      </w:r>
+    </w:p>
+    <w:p>
+      <w:pPr>
+        <w:rPr>
+          <w:sz w:val="16"/>
+          <w:szCs w:val="16"/>
+        </w:rPr>
+      </w:pPr>
+      <w:r>
+        <w:rPr>
+          <w:sz w:val="16"/>
+          <w:szCs w:val="16"/>
+        </w:rPr>
+        <w:lastRenderedPageBreak/>
+        <w:t>ETH-X Gaze</w:t>
+      </w:r>
+    </w:p>
+    <w:p>
+      <w:pPr>
+        <w:rPr>
+          <w:sz w:val="16"/>
+          <w:szCs w:val="16"/>
+        </w:rPr>
+      </w:pPr>
+      <w:r>
+        <w:rPr>
+          <w:sz w:val="16"/>
+          <w:szCs w:val="16"/>
+        </w:rPr>
+        <w:t xml:space="preserve">Dieser Datensatz möchte zeigen das neben den </w:t>
+      </w:r>
+      <w:r>
+        <w:rPr>
+          <w:sz w:val="16"/>
+          <w:szCs w:val="16"/>
+        </w:rPr>
+        <w:t>Parametern</w:t>
+      </w:r>
+      <w:r>
+        <w:rPr>
+          <w:sz w:val="16"/>
+          <w:szCs w:val="16"/>
+        </w:rPr>
+        <w:t xml:space="preserve"> Kopfpose und Blickrichtung auch ein großer Fokus auf Variationen der Aufnahmeperspektive, extreme Blickwinkel, unterschiedliche Beleuchtungsverhältnisse und Input Bildauflösungen</w:t>
+      </w:r>
+      <w:r>
+        <w:rPr>
+          <w:sz w:val="16"/>
+          <w:szCs w:val="16"/>
+        </w:rPr>
+        <w:t xml:space="preserve"> sowie das Vorhandensein von Verdeckungen (Brille) gesetzt werden sollte. ETH-X Gaze</w:t>
+      </w:r>
+      <w:r>
+        <w:rPr>
+          <w:sz w:val="16"/>
+          <w:szCs w:val="16"/>
+        </w:rPr>
+        <w:t xml:space="preserve"> setzt auf hochauflösende Bilder und eine breite Verteilung der Samples in den wichtigen Parametern.</w:t>
+      </w:r>
+    </w:p>
+    <w:p>
+      <w:pPr>
+        <w:rPr>
+          <w:sz w:val="16"/>
+          <w:szCs w:val="16"/>
+        </w:rPr>
+      </w:pPr>
+      <w:r>
+        <w:rPr>
+          <w:sz w:val="16"/>
+          <w:szCs w:val="16"/>
+        </w:rPr>
+        <w:t>Aufbau: Es werden 18x Canon 250D digital SLR Kameras genutzt in verschiedenen Blickwinkeln. 5x Paare zur Erfassung der Geometrie und 8x zur Texturerfassung (erlaubt 3D Gesichtskonstruktion). Die Auflösung der Kameras beträgt 6000x4000 pixel. Für synchrone Bildaufnahme sind die Kameras mit einer ESPER trigger box verbunde. Der Auslöser ist eine kabellose Maus. Sie hat</w:t>
+      </w:r>
+      <w:r>
+        <w:rPr>
+          <w:sz w:val="16"/>
+          <w:szCs w:val="16"/>
+        </w:rPr>
+        <w:t xml:space="preserve"> nach dem Klick</w:t>
+      </w:r>
+      <w:r>
+        <w:rPr>
+          <w:sz w:val="16"/>
+          <w:szCs w:val="16"/>
+        </w:rPr>
+        <w:t xml:space="preserve"> eine Verzögerung von 0.05 Sekunden </w:t>
+      </w:r>
+      <w:r>
+        <w:rPr>
+          <w:sz w:val="16"/>
+          <w:szCs w:val="16"/>
+        </w:rPr>
+        <w:t>bevor ein Bild aufgenommen wird. Eine Leinwand (120x100 cm) wird mittig der Kameras platziert und ein Projektor zeigt das Testprogramm. Hier wird ein Raspberry Pi als Computer verwendet. Es gibt 4</w:t>
+      </w:r>
+      <w:r>
+        <w:rPr>
+          <w:sz w:val="16"/>
+          <w:szCs w:val="16"/>
+        </w:rPr>
+        <w:t>x</w:t>
+      </w:r>
+      <w:r>
+        <w:rPr>
+          <w:sz w:val="16"/>
+          <w:szCs w:val="16"/>
+        </w:rPr>
+        <w:t xml:space="preserve"> Lichtboxen (Walimex Daylight 250), 2 links, 2 rechts die ungefähr ~4500lm ausstrahlen. Jede Lichtbox kann an und ausgeschaltet werden (15 verschiedene Zustände). Als letztes werden Polarisierungsfilter vor Lichtboxen und Kameras platziert. Testpersonen sitzen 1 Meter entfernt von der Leinwand an einer Kopfstütze um eigene Kopfbewegungen zu vermeiden. </w:t>
+      </w:r>
+    </w:p>
+    <w:p>
+      <w:pPr>
+        <w:rPr>
+          <w:sz w:val="16"/>
+          <w:szCs w:val="16"/>
+        </w:rPr>
+      </w:pPr>
+      <w:r>
+        <w:rPr>
+          <w:sz w:val="16"/>
+          <w:szCs w:val="16"/>
+        </w:rPr>
+        <w:t xml:space="preserve">Test: Auf der Leinwand erscheinen schrumpfende Kreise. Sobald ein Kreis ein Punkt wird, soll die Testperson einen Klick mit der Maus ausführen. </w:t>
+      </w:r>
+      <w:r>
+        <w:rPr>
+          <w:sz w:val="16"/>
+          <w:szCs w:val="16"/>
+        </w:rPr>
+        <w:t xml:space="preserve">[ </w:t>
+      </w:r>
+      <w:r>
+        <w:rPr>
+          <w:sz w:val="16"/>
+          <w:szCs w:val="16"/>
+        </w:rPr>
+        <w:t>1) Es gibt ein Fenster von 500ms als Reaktionszeit. 2) Die Schrumpfzeit ist zufällig. 3) Die Testperson muss eine bestimmte Anzahl von Kreisen bestätigen. Jeder Fehler erhöht die Anzahl</w:t>
+      </w:r>
+      <w:r>
+        <w:rPr>
+          <w:sz w:val="16"/>
+          <w:szCs w:val="16"/>
+        </w:rPr>
+        <w:t>. ] Für den Großteil des Datensatzes sind alle 4x Lichtboxen angeschaltet. Ein kleiner Teil beschäftigt sich mit der Variation in den 15 Lichtzuständen.</w:t>
+      </w:r>
+    </w:p>
+    <w:p>
+      <w:pPr>
+        <w:rPr>
+          <w:sz w:val="16"/>
+          <w:szCs w:val="16"/>
+        </w:rPr>
+      </w:pPr>
+      <w:r>
+        <w:rPr>
+          <w:sz w:val="16"/>
+          <w:szCs w:val="16"/>
+        </w:rPr>
+        <w:t>Insgesamt gibt es Samples von 110 Testpersonen (47 weiblich, 63 männlich) zwischen 19-41 Jahren. 17x Kontaktlinsen und 17x Brillen. Ethnien: kaukasisch, mittlerer Osten, Ostasien, Südasien und afrikanisch</w:t>
+      </w:r>
+    </w:p>
+    <w:p>
+      <w:pPr>
+        <w:rPr>
+          <w:sz w:val="16"/>
+          <w:szCs w:val="16"/>
+        </w:rPr>
+      </w:pPr>
+      <w:r>
+        <w:rPr>
+          <w:sz w:val="16"/>
+          <w:szCs w:val="16"/>
+        </w:rPr>
+        <w:t>Kann benutzt werden zum Training und zur Evaluierung.</w:t>
+      </w:r>
+    </w:p>
+    <w:p>
+      <w:pPr>
+        <w:rPr>
+          <w:sz w:val="16"/>
+          <w:szCs w:val="16"/>
+        </w:rPr>
+      </w:pPr>
+    </w:p>
+    <w:p>
+      <w:pPr>
+        <w:rPr>
+          <w:sz w:val="16"/>
+          <w:szCs w:val="16"/>
+        </w:rPr>
+      </w:pPr>
+      <w:r>
+        <w:rPr>
+          <w:sz w:val="16"/>
+          <w:szCs w:val="16"/>
+        </w:rPr>
+        <w:br w:type="page"/>
+      </w:r>
+    </w:p>
+    <w:p>
+      <w:pPr>
+        <w:rPr>
+          <w:sz w:val="16"/>
+          <w:szCs w:val="16"/>
+        </w:rPr>
+      </w:pPr>
+      <w:r>
+        <w:rPr>
+          <w:sz w:val="16"/>
+          <w:szCs w:val="16"/>
+        </w:rPr>
+        <w:lastRenderedPageBreak/>
+        <w:t>GazeUnconstrained:</w:t>
+      </w:r>
+    </w:p>
+    <w:p>
+      <w:pPr>
+        <w:rPr>
+          <w:sz w:val="16"/>
+          <w:szCs w:val="16"/>
+        </w:rPr>
+      </w:pPr>
+      <w:r>
+        <w:rPr>
+          <w:sz w:val="16"/>
+          <w:szCs w:val="16"/>
+        </w:rPr>
+        <w:t>Ein Datensatz der Testpersonen aufnimmt während sie eine TV-Serie schauen.</w:t>
+      </w:r>
     </w:p>
     <w:sectPr>
       <w:footerReference w:type="even" r:id="rId7"/>

</xml_diff>